<commit_message>
Rebuild portfolio around selected work and add Jos PGD to CV.
</commit_message>
<xml_diff>
--- a/assets/Ofogba-Onoriode-CV.docx
+++ b/assets/Ofogba-Onoriode-CV.docx
@@ -71,11 +71,21 @@
         <w:rPr>
           <w:rStyle w:val="lt-line-clampline"/>
           <w:rFonts w:asciiTheme="majorHAnsi" w:hAnsiTheme="majorHAnsi" w:cs="Times New Roman"/>
-          <w:b/>
+          <w:bCs/>
           <w:bdr w:val="none" w:sz="0" w:space="0" w:color="auto" w:frame="1"/>
           <w:shd w:val="clear" w:color="auto" w:fill="FFFFFF"/>
         </w:rPr>
-        <w:t>Location:</w:t>
+        <w:t>Abuja, Nigeria</w:t>
+      </w:r>
+      <w:r>
+        <w:rPr>
+          <w:rStyle w:val="lt-line-clampline"/>
+          <w:rFonts w:asciiTheme="majorHAnsi" w:hAnsiTheme="majorHAnsi" w:cs="Times New Roman"/>
+          <w:b/>
+          <w:bdr w:val="none" w:sz="0" w:space="0" w:color="auto" w:frame="1"/>
+          <w:shd w:val="clear" w:color="auto" w:fill="FFFFFF"/>
+        </w:rPr>
+        <w:t xml:space="preserve"> |</w:t>
       </w:r>
       <w:r>
         <w:rPr>
@@ -85,7 +95,26 @@
           <w:bdr w:val="none" w:sz="0" w:space="0" w:color="auto" w:frame="1"/>
           <w:shd w:val="clear" w:color="auto" w:fill="FFFFFF"/>
         </w:rPr>
-        <w:t xml:space="preserve"> Abuja</w:t>
+        <w:t xml:space="preserve"> </w:t>
+      </w:r>
+      <w:r>
+        <w:rPr>
+          <w:rFonts w:asciiTheme="majorHAnsi" w:hAnsiTheme="majorHAnsi" w:cs="Times New Roman"/>
+          <w:bCs/>
+          <w:bdr w:val="none" w:sz="0" w:space="0" w:color="auto" w:frame="1"/>
+          <w:shd w:val="clear" w:color="auto" w:fill="FFFFFF"/>
+        </w:rPr>
+        <w:t>ofogbaonoriode001@gmail.com</w:t>
+      </w:r>
+      <w:r>
+        <w:rPr>
+          <w:rStyle w:val="lt-line-clampline"/>
+          <w:rFonts w:asciiTheme="majorHAnsi" w:hAnsiTheme="majorHAnsi" w:cs="Times New Roman"/>
+          <w:b/>
+          <w:bdr w:val="none" w:sz="0" w:space="0" w:color="auto" w:frame="1"/>
+          <w:shd w:val="clear" w:color="auto" w:fill="FFFFFF"/>
+        </w:rPr>
+        <w:t xml:space="preserve"> | </w:t>
       </w:r>
       <w:r>
         <w:rPr>
@@ -95,7 +124,7 @@
           <w:bdr w:val="none" w:sz="0" w:space="0" w:color="auto" w:frame="1"/>
           <w:shd w:val="clear" w:color="auto" w:fill="FFFFFF"/>
         </w:rPr>
-        <w:t>, Nigeria</w:t>
+        <w:t>+2348137266555</w:t>
       </w:r>
       <w:r>
         <w:rPr>
@@ -105,57 +134,18 @@
           <w:bdr w:val="none" w:sz="0" w:space="0" w:color="auto" w:frame="1"/>
           <w:shd w:val="clear" w:color="auto" w:fill="FFFFFF"/>
         </w:rPr>
-        <w:t xml:space="preserve"> | Email</w:t>
-      </w:r>
-      <w:r>
-        <w:rPr>
-          <w:rStyle w:val="lt-line-clampline"/>
-          <w:rFonts w:asciiTheme="majorHAnsi" w:hAnsiTheme="majorHAnsi" w:cs="Times New Roman"/>
-          <w:bCs/>
-          <w:bdr w:val="none" w:sz="0" w:space="0" w:color="auto" w:frame="1"/>
-          <w:shd w:val="clear" w:color="auto" w:fill="FFFFFF"/>
-        </w:rPr>
-        <w:t xml:space="preserve">: </w:t>
-      </w:r>
-      <w:r>
-        <w:rPr>
-          <w:rFonts w:asciiTheme="majorHAnsi" w:hAnsiTheme="majorHAnsi" w:cs="Times New Roman"/>
-          <w:bCs/>
-          <w:bdr w:val="none" w:sz="0" w:space="0" w:color="auto" w:frame="1"/>
-          <w:shd w:val="clear" w:color="auto" w:fill="FFFFFF"/>
-        </w:rPr>
-        <w:t>ofogbaonoriode001@gmail.com</w:t>
-      </w:r>
-      <w:r>
-        <w:rPr>
-          <w:rStyle w:val="lt-line-clampline"/>
-          <w:rFonts w:asciiTheme="majorHAnsi" w:hAnsiTheme="majorHAnsi" w:cs="Times New Roman"/>
-          <w:b/>
-          <w:bdr w:val="none" w:sz="0" w:space="0" w:color="auto" w:frame="1"/>
-          <w:shd w:val="clear" w:color="auto" w:fill="FFFFFF"/>
-        </w:rPr>
-        <w:t xml:space="preserve"> | Phone: </w:t>
-      </w:r>
-      <w:r>
-        <w:rPr>
-          <w:rStyle w:val="lt-line-clampline"/>
-          <w:rFonts w:asciiTheme="majorHAnsi" w:hAnsiTheme="majorHAnsi" w:cs="Times New Roman"/>
-          <w:bCs/>
-          <w:bdr w:val="none" w:sz="0" w:space="0" w:color="auto" w:frame="1"/>
-          <w:shd w:val="clear" w:color="auto" w:fill="FFFFFF"/>
-        </w:rPr>
-        <w:t>+234</w:t>
-      </w:r>
-      <w:r>
-        <w:rPr>
-          <w:rStyle w:val="lt-line-clampline"/>
-          <w:rFonts w:asciiTheme="majorHAnsi" w:hAnsiTheme="majorHAnsi" w:cs="Times New Roman"/>
-          <w:bCs/>
-          <w:bdr w:val="none" w:sz="0" w:space="0" w:color="auto" w:frame="1"/>
-          <w:shd w:val="clear" w:color="auto" w:fill="FFFFFF"/>
-        </w:rPr>
-        <w:t>8137266555</w:t>
-      </w:r>
+        <w:t xml:space="preserve"> | </w:t>
+      </w:r>
+      <w:hyperlink r:id="rId6" w:history="1">
+        <w:r>
+          <w:rPr>
+            <w:rStyle w:val="Hyperlink"/>
+            <w:rFonts w:asciiTheme="majorHAnsi" w:hAnsiTheme="majorHAnsi" w:cs="Times New Roman"/>
+            <w:color w:val="0563C1"/>
+          </w:rPr>
+          <w:t>Portfolio</w:t>
+        </w:r>
+      </w:hyperlink>
     </w:p>
     <w:p>
       <w:pPr>
@@ -180,13 +170,7 @@
         <w:rPr>
           <w:color w:val="539E39"/>
         </w:rPr>
-        <w:t xml:space="preserve">PROFESSIONAL </w:t>
-      </w:r>
-      <w:r>
-        <w:rPr>
-          <w:color w:val="539E39"/>
-        </w:rPr>
-        <w:t>SUMMARY</w:t>
+        <w:t>PROFESSIONAL SUMMARY</w:t>
       </w:r>
     </w:p>
     <w:p>
@@ -271,8 +255,8 @@
           </mc:Choice>
           <mc:Fallback>
             <w:pict>
-              <v:group w14:anchorId="3FE8807C" id="Group 31" o:spid="_x0000_s1026" style="width:541.95pt;height:.75pt;mso-position-horizontal-relative:char;mso-position-vertical-relative:line" coordsize="10839,15" o:gfxdata="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">
-                <v:rect id="Rectangle 32" o:spid="_x0000_s1027" style="position:absolute;width:10839;height:15;visibility:visible;mso-wrap-style:square;v-text-anchor:top" o:gfxdata="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" fillcolor="black" stroked="f"/>
+              <v:group w14:anchorId="3FE8807C" id="Group 31" o:spid="_x0000_s1026" style="width:541.95pt;height:.75pt;mso-position-horizontal-relative:char;mso-position-vertical-relative:line" coordsize="10839,15" o:gfxdata="UEsDBBQABgAIAAAAIQC2gziS/gAAAOEBAAATAAAAW0NvbnRlbnRfVHlwZXNdLnhtbJSRQU7DMBBF 90jcwfIWJU67QAgl6YK0S0CoHGBkTxKLZGx5TGhvj5O2G0SRWNoz/78nu9wcxkFMGNg6quQqL6RA 0s5Y6ir5vt9lD1JwBDIwOMJKHpHlpr69KfdHjyxSmriSfYz+USnWPY7AufNIadK6MEJMx9ApD/oD OlTrorhX2lFEilmcO2RdNtjC5xDF9pCuTyYBB5bi6bQ4syoJ3g9WQ0ymaiLzg5KdCXlKLjvcW893 SUOqXwnz5DrgnHtJTxOsQfEKIT7DmDSUCaxw7Rqn8787ZsmRM9e2VmPeBN4uqYvTtW7jvijg9N/y JsXecLq0q+WD6m8AAAD//wMAUEsDBBQABgAIAAAAIQA4/SH/1gAAAJQBAAALAAAAX3JlbHMvLnJl bHOkkMFqwzAMhu+DvYPRfXGawxijTi+j0GvpHsDYimMaW0Yy2fr2M4PBMnrbUb/Q94l/f/hMi1qR JVI2sOt6UJgd+ZiDgffL8ekFlFSbvV0oo4EbChzGx4f9GRdb25HMsYhqlCwG5lrLq9biZkxWOiqY 22YiTra2kYMu1l1tQD30/bPm3wwYN0x18gb45AdQl1tp5j/sFB2T0FQ7R0nTNEV3j6o9feQzro1i OWA14Fm+Q8a1a8+Bvu/d/dMb2JY5uiPbhG/ktn4cqGU/er3pcvwCAAD//wMAUEsDBBQABgAIAAAA IQB9W+pnSAIAAAgFAAAOAAAAZHJzL2Uyb0RvYy54bWykVMtu2zAQvBfoPxC8N7KU2LEFy0HgNEaB tA2a9gNoinqgEpdd0pbTr++SdG3DQS+uDgKX++DMLJfzu13fsa1C24IueHo14kxpCWWr64L/+P74 YcqZdUKXogOtCv6qLL9bvH83H0yuMmigKxUyKqJtPpiCN86ZPEmsbFQv7BUYpclZAfbCkYl1UqIY qHrfJdloNEkGwNIgSGUt7T5EJ1+E+lWlpPtaVVY51hWcsLnwx/Bf+3+ymIu8RmGaVu5hiAtQ9KLV dOih1INwgm2wfVOqbyWChcpdSegTqKpWqsCB2KSjMzYrhI0JXOp8qM1BJpL2TKeLy8ov2xWaF/OM ET0tn0D+tKRLMpg6P/V7u47BbD18hpL6KTYOAvFdhb0vQZTYLuj7etBX7RyTtDmZTrPbyZgzSb7Z OBtH+WVDPXqTJJuP+7R0NL2exaQ0pCQij8cFiHtIvuV0h+xRJvt/Mr00wqigvvUyPCNrS7riGWda 9ET9G10uoetOsevME/HHU9xfLW0UkmlYNhSm7hFhaJQoCVbq4wn8SYI3LLXhMmX/LZHIDVq3UtAz vyg4EuzQMbF9ss7jOIb4Blro2vKx7bpgYL1edsi2ws9P+AL0s7BO+2ANPi1W9DuBoOcUtVlD+Ur8 EOIQ0qNBiwbwN2cDDWDB7a+NQMVZ90mTRrP05sZPbDBuxrcZGXjqWZ96hJZUquCOs7hcujjlG4Nt 3dBJaSCt4Z5ubNUG4l7ziGoPlm5PWIVxC8rsnwY/z6d2iDo+YIs/AAAA//8DAFBLAwQUAAYACAAA ACEAn9nRVdsAAAAEAQAADwAAAGRycy9kb3ducmV2LnhtbEyPQWvCQBCF74X+h2UK3uomFcXGbESk 9iQFtVC8jdkxCWZnQ3ZN4r/v2ou9DG94w3vfpMvB1KKj1lWWFcTjCARxbnXFhYLvw+Z1DsJ5ZI21 ZVJwIwfL7PkpxUTbnnfU7X0hQgi7BBWU3jeJlC4vyaAb24Y4eGfbGvRhbQupW+xDuKnlWxTNpMGK Q0OJDa1Lyi/7q1Hw2WO/msQf3fZyXt+Oh+nXzzYmpUYvw2oBwtPgH8dwxw/okAWmk72ydqJWEB7x f/PuRfPJO4hTUFOQWSr/w2e/AAAA//8DAFBLAQItABQABgAIAAAAIQC2gziS/gAAAOEBAAATAAAA AAAAAAAAAAAAAAAAAABbQ29udGVudF9UeXBlc10ueG1sUEsBAi0AFAAGAAgAAAAhADj9If/WAAAA lAEAAAsAAAAAAAAAAAAAAAAALwEAAF9yZWxzLy5yZWxzUEsBAi0AFAAGAAgAAAAhAH1b6mdIAgAA CAUAAA4AAAAAAAAAAAAAAAAALgIAAGRycy9lMm9Eb2MueG1sUEsBAi0AFAAGAAgAAAAhAJ/Z0VXb AAAABAEAAA8AAAAAAAAAAAAAAAAAogQAAGRycy9kb3ducmV2LnhtbFBLBQYAAAAABAAEAPMAAACq BQAAAAA= ">
+                <v:rect id="Rectangle 32" o:spid="_x0000_s1027" style="position:absolute;width:10839;height:15;visibility:visible;mso-wrap-style:square;v-text-anchor:top" o:gfxdata="UEsDBBQABgAIAAAAIQDb4fbL7gAAAIUBAAATAAAAW0NvbnRlbnRfVHlwZXNdLnhtbHyQz07DMAyH 70i8Q+QralM4IITa7kDhCAiNB7ASt43WOlEcyvb2pNu4IODoPz9/n1xv9vOkForiPDdwXVagiI23 jocG3rdPxR0oScgWJ8/UwIEENu3lRb09BBKV0ywNjCmFe63FjDSjlD4Q50nv44wpl3HQAc0OB9I3 VXWrjedEnIq03oC27qjHjympx31un0wiTQLq4bS4shrAECZnMGVTvbD9QSnOhDInjzsyuiBXWQP0 r4R18jfgnHvJr4nOknrFmJ5xzhraRtHWf3Kkpfz/yGo5S+H73hkquyhdjr3R8m2lj09svwAAAP// AwBQSwMEFAAGAAgAAAAhAFr0LFu/AAAAFQEAAAsAAABfcmVscy8ucmVsc2zPwWrDMAwG4Ptg72B0 X5TuUMaI01uh19I+gLGVxCy2jGSy9e1nemrHjpL4P0nD4SetZiPRyNnCruvBUPYcYp4tXC/Htw8w Wl0ObuVMFm6kcBhfX4Yzra62kC6xqGlKVgtLreUTUf1CyWnHhXKbTCzJ1VbKjMX5LzcTvvf9HuXR gPHJNKdgQU5hB+ZyK23zHztFL6w81c5zQp6m6P9TMfB3PtPWFCczVQtB9N4U2rp2HOA44NMz4y8A AAD//wMAUEsDBBQABgAIAAAAIQA2MRWOwwAAANsAAAAPAAAAZHJzL2Rvd25yZXYueG1sRE9Na8JA EL0L/odlhN50Y6hFY1apgtCLUG0P9TbJjkkwO5vubjXtr+8WhN7m8T4nX/emFVdyvrGsYDpJQBCX VjdcKXh/243nIHxA1thaJgXf5GG9Gg5yzLS98YGux1CJGMI+QwV1CF0mpS9rMugntiOO3Nk6gyFC V0nt8BbDTSvTJHmSBhuODTV2tK2pvBy/jILNYr75fH3k/c+hONHpo7jMUpco9TDqn5cgAvXhX3x3 v+g4P4W/X+IBcvULAAD//wMAUEsBAi0AFAAGAAgAAAAhANvh9svuAAAAhQEAABMAAAAAAAAAAAAA AAAAAAAAAFtDb250ZW50X1R5cGVzXS54bWxQSwECLQAUAAYACAAAACEAWvQsW78AAAAVAQAACwAA AAAAAAAAAAAAAAAfAQAAX3JlbHMvLnJlbHNQSwECLQAUAAYACAAAACEANjEVjsMAAADbAAAADwAA AAAAAAAAAAAAAAAHAgAAZHJzL2Rvd25yZXYueG1sUEsFBgAAAAADAAMAtwAAAPcCAAAAAA== " fillcolor="black" stroked="f"/>
                 <w10:anchorlock/>
               </v:group>
             </w:pict>
@@ -425,8 +409,8 @@
           </mc:Choice>
           <mc:Fallback>
             <w:pict>
-              <v:group w14:anchorId="599307ED" id="Group 18" o:spid="_x0000_s1026" style="width:541.95pt;height:.75pt;mso-position-horizontal-relative:char;mso-position-vertical-relative:line" coordsize="10839,15" o:gfxdata="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">
-                <v:rect id="Rectangle 19" o:spid="_x0000_s1027" style="position:absolute;width:10839;height:15;visibility:visible;mso-wrap-style:square;v-text-anchor:top" o:gfxdata="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" fillcolor="black" stroked="f"/>
+              <v:group w14:anchorId="599307ED" id="Group 18" o:spid="_x0000_s1026" style="width:541.95pt;height:.75pt;mso-position-horizontal-relative:char;mso-position-vertical-relative:line" coordsize="10839,15" o:gfxdata="UEsDBBQABgAIAAAAIQC2gziS/gAAAOEBAAATAAAAW0NvbnRlbnRfVHlwZXNdLnhtbJSRQU7DMBBF 90jcwfIWJU67QAgl6YK0S0CoHGBkTxKLZGx5TGhvj5O2G0SRWNoz/78nu9wcxkFMGNg6quQqL6RA 0s5Y6ir5vt9lD1JwBDIwOMJKHpHlpr69KfdHjyxSmriSfYz+USnWPY7AufNIadK6MEJMx9ApD/oD OlTrorhX2lFEilmcO2RdNtjC5xDF9pCuTyYBB5bi6bQ4syoJ3g9WQ0ymaiLzg5KdCXlKLjvcW893 SUOqXwnz5DrgnHtJTxOsQfEKIT7DmDSUCaxw7Rqn8787ZsmRM9e2VmPeBN4uqYvTtW7jvijg9N/y JsXecLq0q+WD6m8AAAD//wMAUEsDBBQABgAIAAAAIQA4/SH/1gAAAJQBAAALAAAAX3JlbHMvLnJl bHOkkMFqwzAMhu+DvYPRfXGawxijTi+j0GvpHsDYimMaW0Yy2fr2M4PBMnrbUb/Q94l/f/hMi1qR JVI2sOt6UJgd+ZiDgffL8ekFlFSbvV0oo4EbChzGx4f9GRdb25HMsYhqlCwG5lrLq9biZkxWOiqY 22YiTra2kYMu1l1tQD30/bPm3wwYN0x18gb45AdQl1tp5j/sFB2T0FQ7R0nTNEV3j6o9feQzro1i OWA14Fm+Q8a1a8+Bvu/d/dMb2JY5uiPbhG/ktn4cqGU/er3pcvwCAAD//wMAUEsDBBQABgAIAAAA IQBzh17vRwIAAAgFAAAOAAAAZHJzL2Uyb0RvYy54bWykVNuO2jAQfa/Uf7D8XkIosBARViu2iypt 21W3/QDjOBc18bhjQ9h+/Y5tCohVX2geIo/n4nPOeLy43Xct2ym0Deicp4MhZ0pLKBpd5fznj4cP M86sE7oQLWiV8xdl+e3y/btFbzI1ghraQiGjItpmvcl57ZzJksTKWnXCDsAoTc4SsBOOTKySAkVP 1bs2GQ2H06QHLAyCVNbS7n108mWoX5ZKum9laZVjbc4Jmwt/DP+N/yfLhcgqFKZu5AGGuAJFJxpN hx5L3Qsn2BabN6W6RiJYKN1AQpdAWTZSBQ7EJh1esFkjbE3gUmV9ZY4ykbQXOl1dVn7drdE8myeM 6Gn5CPKXJV2S3lTZud/bVQxmm/4LFNRPsXUQiO9L7HwJosT2Qd+Xo75q75ikzelsNrqZTjiT5JtP RpMov6ypR2+SZP3pkJYOZx/nMSkNKYnI4nEB4gGSbzndIXuSyf6fTM+1MCqob70MT8iagq443SIt OqL+nS6X0FWrWDr3RPzxFPdXSxuFZBpWNYWpO0ToayUKgpX6eAJ/luANS224Ttl/SyQyg9atFXTM L3KOBDt0TOwerfM4TiG+gRbapnho2jYYWG1WLbKd8PMTvgD9IqzVPliDT4sV/U4g6DlFbTZQvBA/ hDiE9GjQogb8w1lPA5hz+3srUHHWftak0Twdj/3EBmM8uRmRgeeezblHaEmlcu44i8uVi1O+NdhU NZ2UBtIa7ujGlk0g7jWPqA5g6faEVRi3oMzhafDzfG6HqNMDtnwFAAD//wMAUEsDBBQABgAIAAAA IQCf2dFV2wAAAAQBAAAPAAAAZHJzL2Rvd25yZXYueG1sTI9Ba8JAEIXvhf6HZQre6iYVxcZsRKT2 JAW1ULyN2TEJZmdDdk3iv+/ai70Mb3jDe9+ky8HUoqPWVZYVxOMIBHFudcWFgu/D5nUOwnlkjbVl UnAjB8vs+SnFRNued9TtfSFCCLsEFZTeN4mULi/JoBvbhjh4Z9sa9GFtC6lb7EO4qeVbFM2kwYpD Q4kNrUvKL/urUfDZY7+axB/d9nJe346H6dfPNialRi/DagHC0+Afx3DHD+iQBaaTvbJ2olYQHvF/ 8+5F88k7iFNQU5BZKv/DZ78AAAD//wMAUEsBAi0AFAAGAAgAAAAhALaDOJL+AAAA4QEAABMAAAAA AAAAAAAAAAAAAAAAAFtDb250ZW50X1R5cGVzXS54bWxQSwECLQAUAAYACAAAACEAOP0h/9YAAACU AQAACwAAAAAAAAAAAAAAAAAvAQAAX3JlbHMvLnJlbHNQSwECLQAUAAYACAAAACEAc4de70cCAAAI BQAADgAAAAAAAAAAAAAAAAAuAgAAZHJzL2Uyb0RvYy54bWxQSwECLQAUAAYACAAAACEAn9nRVdsA AAAEAQAADwAAAAAAAAAAAAAAAAChBAAAZHJzL2Rvd25yZXYueG1sUEsFBgAAAAAEAAQA8wAAAKkF AAAAAA== ">
+                <v:rect id="Rectangle 19" o:spid="_x0000_s1027" style="position:absolute;width:10839;height:15;visibility:visible;mso-wrap-style:square;v-text-anchor:top" o:gfxdata="UEsDBBQABgAIAAAAIQDb4fbL7gAAAIUBAAATAAAAW0NvbnRlbnRfVHlwZXNdLnhtbHyQz07DMAyH 70i8Q+QralM4IITa7kDhCAiNB7ASt43WOlEcyvb2pNu4IODoPz9/n1xv9vOkForiPDdwXVagiI23 jocG3rdPxR0oScgWJ8/UwIEENu3lRb09BBKV0ywNjCmFe63FjDSjlD4Q50nv44wpl3HQAc0OB9I3 VXWrjedEnIq03oC27qjHjympx31un0wiTQLq4bS4shrAECZnMGVTvbD9QSnOhDInjzsyuiBXWQP0 r4R18jfgnHvJr4nOknrFmJ5xzhraRtHWf3Kkpfz/yGo5S+H73hkquyhdjr3R8m2lj09svwAAAP// AwBQSwMEFAAGAAgAAAAhAFr0LFu/AAAAFQEAAAsAAABfcmVscy8ucmVsc2zPwWrDMAwG4Ptg72B0 X5TuUMaI01uh19I+gLGVxCy2jGSy9e1nemrHjpL4P0nD4SetZiPRyNnCruvBUPYcYp4tXC/Htw8w Wl0ObuVMFm6kcBhfX4Yzra62kC6xqGlKVgtLreUTUf1CyWnHhXKbTCzJ1VbKjMX5LzcTvvf9HuXR gPHJNKdgQU5hB+ZyK23zHztFL6w81c5zQp6m6P9TMfB3PtPWFCczVQtB9N4U2rp2HOA44NMz4y8A AAD//wMAUEsDBBQABgAIAAAAIQCpry5ixgAAANsAAAAPAAAAZHJzL2Rvd25yZXYueG1sRI9Pb8Iw DMXvSPsOkSdxg3SIIdYREEyatMuk8ecAN9N4bUXjlCSDbp9+PiBxs/We3/t5tuhcoy4UYu3ZwNMw A0VceFtzaWC3fR9MQcWEbLHxTAZ+KcJi/tCbYW79ldd02aRSSQjHHA1UKbW51rGoyGEc+pZYtG8f HCZZQ6ltwKuEu0aPsmyiHdYsDRW29FZRcdr8OAOrl+nq/DXmz7/18UCH/fH0PAqZMf3HbvkKKlGX 7ubb9YcVfKGXX2QAPf8HAAD//wMAUEsBAi0AFAAGAAgAAAAhANvh9svuAAAAhQEAABMAAAAAAAAA AAAAAAAAAAAAAFtDb250ZW50X1R5cGVzXS54bWxQSwECLQAUAAYACAAAACEAWvQsW78AAAAVAQAA CwAAAAAAAAAAAAAAAAAfAQAAX3JlbHMvLnJlbHNQSwECLQAUAAYACAAAACEAqa8uYsYAAADbAAAA DwAAAAAAAAAAAAAAAAAHAgAAZHJzL2Rvd25yZXYueG1sUEsFBgAAAAADAAMAtwAAAPoCAAAAAA== " fillcolor="black" stroked="f"/>
                 <w10:anchorlock/>
               </v:group>
             </w:pict>
@@ -611,7 +595,7 @@
           <w:sz w:val="20"/>
           <w:szCs w:val="20"/>
         </w:rPr>
-        <w:t xml:space="preserve">: Time management, teamwork, communication, leadership, problem solving, front-end web development (HTML, CSS, basic JavaScript). </w:t>
+        <w:t xml:space="preserve">: Time management, teamwork, communication, leadership, problem-solving, front-end web development (HTML, CSS, basic JavaScript). </w:t>
       </w:r>
     </w:p>
     <w:p>
@@ -736,8 +720,8 @@
           </mc:Choice>
           <mc:Fallback>
             <w:pict>
-              <v:group w14:anchorId="6459F9AD" id="Group 14" o:spid="_x0000_s1026" style="width:541.95pt;height:.75pt;mso-position-horizontal-relative:char;mso-position-vertical-relative:line" coordsize="10839,15" o:gfxdata="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">
-                <v:rect id="Rectangle 15" o:spid="_x0000_s1027" style="position:absolute;width:10839;height:15;visibility:visible;mso-wrap-style:square;v-text-anchor:top" o:gfxdata="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" fillcolor="black" stroked="f"/>
+              <v:group w14:anchorId="6459F9AD" id="Group 14" o:spid="_x0000_s1026" style="width:541.95pt;height:.75pt;mso-position-horizontal-relative:char;mso-position-vertical-relative:line" coordsize="10839,15" o:gfxdata="UEsDBBQABgAIAAAAIQC2gziS/gAAAOEBAAATAAAAW0NvbnRlbnRfVHlwZXNdLnhtbJSRQU7DMBBF 90jcwfIWJU67QAgl6YK0S0CoHGBkTxKLZGx5TGhvj5O2G0SRWNoz/78nu9wcxkFMGNg6quQqL6RA 0s5Y6ir5vt9lD1JwBDIwOMJKHpHlpr69KfdHjyxSmriSfYz+USnWPY7AufNIadK6MEJMx9ApD/oD OlTrorhX2lFEilmcO2RdNtjC5xDF9pCuTyYBB5bi6bQ4syoJ3g9WQ0ymaiLzg5KdCXlKLjvcW893 SUOqXwnz5DrgnHtJTxOsQfEKIT7DmDSUCaxw7Rqn8787ZsmRM9e2VmPeBN4uqYvTtW7jvijg9N/y JsXecLq0q+WD6m8AAAD//wMAUEsDBBQABgAIAAAAIQA4/SH/1gAAAJQBAAALAAAAX3JlbHMvLnJl bHOkkMFqwzAMhu+DvYPRfXGawxijTi+j0GvpHsDYimMaW0Yy2fr2M4PBMnrbUb/Q94l/f/hMi1qR JVI2sOt6UJgd+ZiDgffL8ekFlFSbvV0oo4EbChzGx4f9GRdb25HMsYhqlCwG5lrLq9biZkxWOiqY 22YiTra2kYMu1l1tQD30/bPm3wwYN0x18gb45AdQl1tp5j/sFB2T0FQ7R0nTNEV3j6o9feQzro1i OWA14Fm+Q8a1a8+Bvu/d/dMb2JY5uiPbhG/ktn4cqGU/er3pcvwCAAD//wMAUEsDBBQABgAIAAAA IQDP2nbKRQIAAAcFAAAOAAAAZHJzL2Uyb0RvYy54bWykVNuO2jAQfa/Uf7D8XkIosBARViu2iypt 21W3/QDjOBc18bhjQ9h+/Y5tCohVX2geIo/n4nPOeLy43Xct2ym0Deicp4MhZ0pLKBpd5fznj4cP M86sE7oQLWiV8xdl+e3y/btFbzI1ghraQiGjItpmvcl57ZzJksTKWnXCDsAoTc4SsBOOTKySAkVP 1bs2GQ2H06QHLAyCVNbS7n108mWoX5ZKum9laZVjbc4Jmwt/DP+N/yfLhcgqFKZu5AGGuAJFJxpN hx5L3Qsn2BabN6W6RiJYKN1AQpdAWTZSBQ7EJh1esFkjbE3gUmV9ZY4ykbQXOl1dVn7drdE8myeM 6Gn5CPKXJV2S3lTZud/bVQxmm/4LFNRPsXUQiO9L7HwJosT2Qd+Xo75q75ikzelsNrqZTjiT5JtP RpMov6ypR2+SZP3pkJYOZx/nMSkNKYnI4nEB4gGSbzndIXuSyf6fTM+1MCqob70MT8iaIud0n7Xo iPl3ultCV61iEZQ/ncL+SmmjjkzDqqYwdYcIfa1EQahSz5uwnyV4w1IXrhP23wqJzKB1awUd84uc I8EODRO7R+s8jlOI75+FtikemrYNBlabVYtsJ/z4hC9AvwhrtQ/W4NNiRb8TCHpOsTMbKF6IH0Kc QXozaFED/uGsp/nLuf29Fag4az9r0miejsd+YIMxntyMyMBzz+bcI7SkUjl3nMXlysUh3xpsqppO SgNpDXd0YcsmEPeaR1QHsHR5wipMW1Dm8DL4cT63Q9Tp/Vq+AgAA//8DAFBLAwQUAAYACAAAACEA n9nRVdsAAAAEAQAADwAAAGRycy9kb3ducmV2LnhtbEyPQWvCQBCF74X+h2UK3uomFcXGbESk9iQF tVC8jdkxCWZnQ3ZN4r/v2ou9DG94w3vfpMvB1KKj1lWWFcTjCARxbnXFhYLvw+Z1DsJ5ZI21ZVJw IwfL7PkpxUTbnnfU7X0hQgi7BBWU3jeJlC4vyaAb24Y4eGfbGvRhbQupW+xDuKnlWxTNpMGKQ0OJ Da1Lyi/7q1Hw2WO/msQf3fZyXt+Oh+nXzzYmpUYvw2oBwtPgH8dwxw/okAWmk72ydqJWEB7xf/Pu RfPJO4hTUFOQWSr/w2e/AAAA//8DAFBLAQItABQABgAIAAAAIQC2gziS/gAAAOEBAAATAAAAAAAA AAAAAAAAAAAAAABbQ29udGVudF9UeXBlc10ueG1sUEsBAi0AFAAGAAgAAAAhADj9If/WAAAAlAEA AAsAAAAAAAAAAAAAAAAALwEAAF9yZWxzLy5yZWxzUEsBAi0AFAAGAAgAAAAhAM/adspFAgAABwUA AA4AAAAAAAAAAAAAAAAALgIAAGRycy9lMm9Eb2MueG1sUEsBAi0AFAAGAAgAAAAhAJ/Z0VXbAAAA BAEAAA8AAAAAAAAAAAAAAAAAnwQAAGRycy9kb3ducmV2LnhtbFBLBQYAAAAABAAEAPMAAACnBQAA AAA= ">
+                <v:rect id="Rectangle 15" o:spid="_x0000_s1027" style="position:absolute;width:10839;height:15;visibility:visible;mso-wrap-style:square;v-text-anchor:top" o:gfxdata="UEsDBBQABgAIAAAAIQDb4fbL7gAAAIUBAAATAAAAW0NvbnRlbnRfVHlwZXNdLnhtbHyQz07DMAyH 70i8Q+QralM4IITa7kDhCAiNB7ASt43WOlEcyvb2pNu4IODoPz9/n1xv9vOkForiPDdwXVagiI23 jocG3rdPxR0oScgWJ8/UwIEENu3lRb09BBKV0ywNjCmFe63FjDSjlD4Q50nv44wpl3HQAc0OB9I3 VXWrjedEnIq03oC27qjHjympx31un0wiTQLq4bS4shrAECZnMGVTvbD9QSnOhDInjzsyuiBXWQP0 r4R18jfgnHvJr4nOknrFmJ5xzhraRtHWf3Kkpfz/yGo5S+H73hkquyhdjr3R8m2lj09svwAAAP// AwBQSwMEFAAGAAgAAAAhAFr0LFu/AAAAFQEAAAsAAABfcmVscy8ucmVsc2zPwWrDMAwG4Ptg72B0 X5TuUMaI01uh19I+gLGVxCy2jGSy9e1nemrHjpL4P0nD4SetZiPRyNnCruvBUPYcYp4tXC/Htw8w Wl0ObuVMFm6kcBhfX4Yzra62kC6xqGlKVgtLreUTUf1CyWnHhXKbTCzJ1VbKjMX5LzcTvvf9HuXR gPHJNKdgQU5hB+ZyK23zHztFL6w81c5zQp6m6P9TMfB3PtPWFCczVQtB9N4U2rp2HOA44NMz4y8A AAD//wMAUEsDBBQABgAIAAAAIQCbPnddwAAAANoAAAAPAAAAZHJzL2Rvd25yZXYueG1sRE/LisIw FN0L8w/hDrjTdETF6RhFBwbcCL4Wurs2d9pic1OTqNWvNwvB5eG8x9PGVOJKzpeWFXx1ExDEmdUl 5wp227/OCIQPyBory6TgTh6mk4/WGFNtb7ym6ybkIoawT1FBEUKdSumzggz6rq2JI/dvncEQocul dniL4aaSvSQZSoMlx4YCa/otKDttLkbB/Hs0P6/6vHysjwc67I+nQc8lSrU/m9kPiEBNeItf7oVW ELfGK/EGyMkTAAD//wMAUEsBAi0AFAAGAAgAAAAhANvh9svuAAAAhQEAABMAAAAAAAAAAAAAAAAA AAAAAFtDb250ZW50X1R5cGVzXS54bWxQSwECLQAUAAYACAAAACEAWvQsW78AAAAVAQAACwAAAAAA AAAAAAAAAAAfAQAAX3JlbHMvLnJlbHNQSwECLQAUAAYACAAAACEAmz53XcAAAADaAAAADwAAAAAA AAAAAAAAAAAHAgAAZHJzL2Rvd25yZXYueG1sUEsFBgAAAAADAAMAtwAAAPQCAAAAAA== " fillcolor="black" stroked="f"/>
                 <w10:anchorlock/>
               </v:group>
             </w:pict>
@@ -759,15 +743,7 @@
           <w:sz w:val="20"/>
           <w:szCs w:val="20"/>
         </w:rPr>
-        <w:t xml:space="preserve">   </w:t>
-      </w:r>
-      <w:r>
-        <w:rPr>
-          <w:b/>
-          <w:sz w:val="20"/>
-          <w:szCs w:val="20"/>
-        </w:rPr>
-        <w:t xml:space="preserve">Civil Engineer/ Project Coordinator </w:t>
+        <w:t xml:space="preserve">   Civil Engineer/ Project Coordinator </w:t>
       </w:r>
     </w:p>
     <w:p>
@@ -795,12 +771,6 @@
           <w:szCs w:val="20"/>
         </w:rPr>
         <w:t xml:space="preserve">, Nigeria. </w:t>
-      </w:r>
-      <w:r>
-        <w:rPr>
-          <w:sz w:val="20"/>
-          <w:szCs w:val="20"/>
-        </w:rPr>
         <w:tab/>
       </w:r>
       <w:r>
@@ -1007,7 +977,7 @@
           <w:sz w:val="20"/>
           <w:szCs w:val="20"/>
         </w:rPr>
-        <w:t xml:space="preserve">Interior Design Assistant (Part-time) </w:t>
+        <w:t>Interior Design Assistant</w:t>
       </w:r>
     </w:p>
     <w:p>
@@ -1035,12 +1005,6 @@
           <w:szCs w:val="20"/>
         </w:rPr>
         <w:t xml:space="preserve"> </w:t>
-      </w:r>
-      <w:r>
-        <w:rPr>
-          <w:sz w:val="20"/>
-          <w:szCs w:val="20"/>
-        </w:rPr>
         <w:tab/>
       </w:r>
       <w:r>
@@ -1197,15 +1161,7 @@
           <w:sz w:val="20"/>
           <w:szCs w:val="20"/>
         </w:rPr>
-        <w:t xml:space="preserve">  </w:t>
-      </w:r>
-      <w:r>
-        <w:rPr>
-          <w:b/>
-          <w:sz w:val="20"/>
-          <w:szCs w:val="20"/>
-        </w:rPr>
-        <w:t xml:space="preserve">Civil &amp; Maintenance Engineering Intern  </w:t>
+        <w:t xml:space="preserve">  Civil &amp; Maintenance Engineering Intern  </w:t>
       </w:r>
     </w:p>
     <w:p>
@@ -1242,12 +1198,6 @@
           <w:szCs w:val="20"/>
         </w:rPr>
         <w:t xml:space="preserve"> </w:t>
-      </w:r>
-      <w:r>
-        <w:rPr>
-          <w:sz w:val="20"/>
-          <w:szCs w:val="20"/>
-        </w:rPr>
         <w:tab/>
       </w:r>
       <w:r>
@@ -1378,43 +1328,27 @@
           <w:sz w:val="20"/>
           <w:szCs w:val="20"/>
         </w:rPr>
+        <w:t xml:space="preserve">     Site Supervisor </w:t>
+      </w:r>
+    </w:p>
+    <w:p>
+      <w:pPr>
+        <w:ind w:left="132" w:hanging="132"/>
+        <w:rPr>
+          <w:sz w:val="20"/>
+          <w:szCs w:val="20"/>
+        </w:rPr>
+      </w:pPr>
+      <w:r>
+        <w:rPr>
+          <w:b/>
+          <w:sz w:val="20"/>
+          <w:szCs w:val="20"/>
+        </w:rPr>
         <w:t xml:space="preserve">   </w:t>
       </w:r>
       <w:r>
         <w:rPr>
-          <w:b/>
-          <w:sz w:val="20"/>
-          <w:szCs w:val="20"/>
-        </w:rPr>
-        <w:t xml:space="preserve">  </w:t>
-      </w:r>
-      <w:r>
-        <w:rPr>
-          <w:b/>
-          <w:sz w:val="20"/>
-          <w:szCs w:val="20"/>
-        </w:rPr>
-        <w:t xml:space="preserve">Site Supervisor </w:t>
-      </w:r>
-    </w:p>
-    <w:p>
-      <w:pPr>
-        <w:ind w:left="132" w:hanging="132"/>
-        <w:rPr>
-          <w:sz w:val="20"/>
-          <w:szCs w:val="20"/>
-        </w:rPr>
-      </w:pPr>
-      <w:r>
-        <w:rPr>
-          <w:b/>
-          <w:sz w:val="20"/>
-          <w:szCs w:val="20"/>
-        </w:rPr>
-        <w:t xml:space="preserve">   </w:t>
-      </w:r>
-      <w:r>
-        <w:rPr>
           <w:i/>
           <w:sz w:val="20"/>
           <w:szCs w:val="20"/>
@@ -1427,23 +1361,7 @@
           <w:sz w:val="20"/>
           <w:szCs w:val="20"/>
         </w:rPr>
-        <w:t xml:space="preserve">Oct 2015 – </w:t>
-      </w:r>
-      <w:r>
-        <w:rPr>
-          <w:b/>
-          <w:sz w:val="20"/>
-          <w:szCs w:val="20"/>
-        </w:rPr>
-        <w:t xml:space="preserve">Nov </w:t>
-      </w:r>
-      <w:r>
-        <w:rPr>
-          <w:b/>
-          <w:sz w:val="20"/>
-          <w:szCs w:val="20"/>
-        </w:rPr>
-        <w:t xml:space="preserve">2016 </w:t>
+        <w:t xml:space="preserve">Oct 2015 – Nov 2016 </w:t>
       </w:r>
       <w:r>
         <w:rPr>
@@ -1462,14 +1380,6 @@
           <w:szCs w:val="20"/>
         </w:rPr>
         <w:t xml:space="preserve"> </w:t>
-      </w:r>
-      <w:r>
-        <w:rPr>
-          <w:rFonts w:ascii="Arial" w:eastAsia="Arial" w:hAnsi="Arial" w:cs="Arial"/>
-          <w:color w:val="539E39"/>
-          <w:sz w:val="20"/>
-          <w:szCs w:val="20"/>
-        </w:rPr>
         <w:tab/>
       </w:r>
       <w:r>
@@ -1658,8 +1568,8 @@
           </mc:Choice>
           <mc:Fallback>
             <w:pict>
-              <v:group w14:anchorId="0FBD741C" id="Group 12" o:spid="_x0000_s1026" style="width:541.95pt;height:.75pt;mso-position-horizontal-relative:char;mso-position-vertical-relative:line" coordsize="10839,15" o:gfxdata="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">
-                <v:rect id="Rectangle 13" o:spid="_x0000_s1027" style="position:absolute;width:10839;height:15;visibility:visible;mso-wrap-style:square;v-text-anchor:top" o:gfxdata="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" fillcolor="black" stroked="f"/>
+              <v:group w14:anchorId="0FBD741C" id="Group 12" o:spid="_x0000_s1026" style="width:541.95pt;height:.75pt;mso-position-horizontal-relative:char;mso-position-vertical-relative:line" coordsize="10839,15" o:gfxdata="UEsDBBQABgAIAAAAIQC2gziS/gAAAOEBAAATAAAAW0NvbnRlbnRfVHlwZXNdLnhtbJSRQU7DMBBF 90jcwfIWJU67QAgl6YK0S0CoHGBkTxKLZGx5TGhvj5O2G0SRWNoz/78nu9wcxkFMGNg6quQqL6RA 0s5Y6ir5vt9lD1JwBDIwOMJKHpHlpr69KfdHjyxSmriSfYz+USnWPY7AufNIadK6MEJMx9ApD/oD OlTrorhX2lFEilmcO2RdNtjC5xDF9pCuTyYBB5bi6bQ4syoJ3g9WQ0ymaiLzg5KdCXlKLjvcW893 SUOqXwnz5DrgnHtJTxOsQfEKIT7DmDSUCaxw7Rqn8787ZsmRM9e2VmPeBN4uqYvTtW7jvijg9N/y JsXecLq0q+WD6m8AAAD//wMAUEsDBBQABgAIAAAAIQA4/SH/1gAAAJQBAAALAAAAX3JlbHMvLnJl bHOkkMFqwzAMhu+DvYPRfXGawxijTi+j0GvpHsDYimMaW0Yy2fr2M4PBMnrbUb/Q94l/f/hMi1qR JVI2sOt6UJgd+ZiDgffL8ekFlFSbvV0oo4EbChzGx4f9GRdb25HMsYhqlCwG5lrLq9biZkxWOiqY 22YiTra2kYMu1l1tQD30/bPm3wwYN0x18gb45AdQl1tp5j/sFB2T0FQ7R0nTNEV3j6o9feQzro1i OWA14Fm+Q8a1a8+Bvu/d/dMb2JY5uiPbhG/ktn4cqGU/er3pcvwCAAD//wMAUEsDBBQABgAIAAAA IQDNLJ7cRgIAAAcFAAAOAAAAZHJzL2Uyb0RvYy54bWykVNuO2jAQfa/Uf7D8XkJYYCEirFZsF1Xa tqtu+wHGcS5q4nHHhrD9+o5tCohVX2geIo/n4nPOeLy423ct2ym0Deicp4MhZ0pLKBpd5fzH98cP M86sE7oQLWiV81dl+d3y/btFbzI1ghraQiGjItpmvcl57ZzJksTKWnXCDsAoTc4SsBOOTKySAkVP 1bs2GQ2H06QHLAyCVNbS7kN08mWoX5ZKuq9laZVjbc4Jmwt/DP+N/yfLhcgqFKZu5AGGuAJFJxpN hx5LPQgn2BabN6W6RiJYKN1AQpdAWTZSBQ7EJh1esFkjbE3gUmV9ZY4ykbQXOl1dVn7ZrdG8mGeM 6Gn5BPKnJV2S3lTZud/bVQxmm/4zFNRPsXUQiO9L7HwJosT2Qd/Xo75q75ikzelsNrqdTjiT5JtP RpMov6ypR2+SZP3xkJYOZzfzmJSGlERk8bgA8QDJt5zukD3JZP9PppdaGBXUt16GZ2RNQRw406Ij 5t/obgldtYqlN56HP53C/kppo45Mw6qmMHWPCH2tREGoUh9P2M8SvGGpC9cJ+2+FRGbQurWCjvlF zpFgh4aJ3ZN1HscpxPfPQtsUj03bBgOrzapFthN+fMIXoF+EtdoHa/BpsaLfCQQ9p6jNBopX4ocQ Z5DeDFrUgL8562n+cm5/bQUqztpPmjSap+OxH9hgjCe3IzLw3LM59wgtqVTOHWdxuXJxyLcGm6qm k9JAWsM9XdiyCcS95hHVASxdnrAK0xaUObwMfpzP7RB1er+WfwAAAP//AwBQSwMEFAAGAAgAAAAh AJ/Z0VXbAAAABAEAAA8AAABkcnMvZG93bnJldi54bWxMj0FrwkAQhe+F/odlCt7qJhXFxmxEpPYk BbVQvI3ZMQlmZ0N2TeK/79qLvQxveMN736TLwdSio9ZVlhXE4wgEcW51xYWC78PmdQ7CeWSNtWVS cCMHy+z5KcVE25531O19IUIIuwQVlN43iZQuL8mgG9uGOHhn2xr0YW0LqVvsQ7ip5VsUzaTBikND iQ2tS8ov+6tR8Nljv5rEH932cl7fjofp1882JqVGL8NqAcLT4B/HcMcP6JAFppO9snaiVhAe8X/z 7kXzyTuIU1BTkFkq/8NnvwAAAP//AwBQSwECLQAUAAYACAAAACEAtoM4kv4AAADhAQAAEwAAAAAA AAAAAAAAAAAAAAAAW0NvbnRlbnRfVHlwZXNdLnhtbFBLAQItABQABgAIAAAAIQA4/SH/1gAAAJQB AAALAAAAAAAAAAAAAAAAAC8BAABfcmVscy8ucmVsc1BLAQItABQABgAIAAAAIQDNLJ7cRgIAAAcF AAAOAAAAAAAAAAAAAAAAAC4CAABkcnMvZTJvRG9jLnhtbFBLAQItABQABgAIAAAAIQCf2dFV2wAA AAQBAAAPAAAAAAAAAAAAAAAAAKAEAABkcnMvZG93bnJldi54bWxQSwUGAAAAAAQABADzAAAAqAUA AAAA ">
+                <v:rect id="Rectangle 13" o:spid="_x0000_s1027" style="position:absolute;width:10839;height:15;visibility:visible;mso-wrap-style:square;v-text-anchor:top" o:gfxdata="UEsDBBQABgAIAAAAIQDb4fbL7gAAAIUBAAATAAAAW0NvbnRlbnRfVHlwZXNdLnhtbHyQz07DMAyH 70i8Q+QralM4IITa7kDhCAiNB7ASt43WOlEcyvb2pNu4IODoPz9/n1xv9vOkForiPDdwXVagiI23 jocG3rdPxR0oScgWJ8/UwIEENu3lRb09BBKV0ywNjCmFe63FjDSjlD4Q50nv44wpl3HQAc0OB9I3 VXWrjedEnIq03oC27qjHjympx31un0wiTQLq4bS4shrAECZnMGVTvbD9QSnOhDInjzsyuiBXWQP0 r4R18jfgnHvJr4nOknrFmJ5xzhraRtHWf3Kkpfz/yGo5S+H73hkquyhdjr3R8m2lj09svwAAAP// AwBQSwMEFAAGAAgAAAAhAFr0LFu/AAAAFQEAAAsAAABfcmVscy8ucmVsc2zPwWrDMAwG4Ptg72B0 X5TuUMaI01uh19I+gLGVxCy2jGSy9e1nemrHjpL4P0nD4SetZiPRyNnCruvBUPYcYp4tXC/Htw8w Wl0ObuVMFm6kcBhfX4Yzra62kC6xqGlKVgtLreUTUf1CyWnHhXKbTCzJ1VbKjMX5LzcTvvf9HuXR gPHJNKdgQU5hB+ZyK23zHztFL6w81c5zQp6m6P9TMfB3PtPWFCczVQtB9N4U2rp2HOA44NMz4y8A AAD//wMAUEsDBBQABgAIAAAAIQCF7Ua0xAAAANoAAAAPAAAAZHJzL2Rvd25yZXYueG1sRI9PawIx FMTvBb9DeIK3mlWs6GoULQi9FPx30Ntz89xd3Lxsk6hbP70RCj0OM/MbZjpvTCVu5HxpWUGvm4Ag zqwuOVew363eRyB8QNZYWSYFv+RhPmu9TTHV9s4bum1DLiKEfYoKihDqVEqfFWTQd21NHL2zdQZD lC6X2uE9wk0l+0kylAZLjgsF1vRZUHbZXo2C5Xi0/FkP+PuxOR3peDhdPvouUarTbhYTEIGa8B/+ a39pBUN4XYk3QM6eAAAA//8DAFBLAQItABQABgAIAAAAIQDb4fbL7gAAAIUBAAATAAAAAAAAAAAA AAAAAAAAAABbQ29udGVudF9UeXBlc10ueG1sUEsBAi0AFAAGAAgAAAAhAFr0LFu/AAAAFQEAAAsA AAAAAAAAAAAAAAAAHwEAAF9yZWxzLy5yZWxzUEsBAi0AFAAGAAgAAAAhAIXtRrTEAAAA2gAAAA8A AAAAAAAAAAAAAAAABwIAAGRycy9kb3ducmV2LnhtbFBLBQYAAAAAAwADALcAAAD4AgAAAAA= " fillcolor="black" stroked="f"/>
                 <w10:anchorlock/>
               </v:group>
             </w:pict>
@@ -1682,7 +1592,7 @@
         <w:ind w:hanging="361"/>
       </w:pPr>
       <w:r>
-        <w:t xml:space="preserve">Higher National Diploma (HND) – </w:t>
+        <w:t xml:space="preserve">Postgraduate Diploma (PGD) – </w:t>
       </w:r>
       <w:r>
         <w:rPr>
@@ -1702,19 +1612,14 @@
         <w:ind w:left="491"/>
       </w:pPr>
       <w:r>
-        <w:t xml:space="preserve">Delta State Polytechnic, Ozoro, Nigeria. </w:t>
-      </w:r>
-      <w:r>
+        <w:t xml:space="preserve">University of Jos, Plateau State, Nigeria. </w:t>
         <w:tab/>
       </w:r>
       <w:r>
-        <w:tab/>
-      </w:r>
-      <w:r>
-        <w:rPr>
-          <w:b/>
-        </w:rPr>
-        <w:t>2018-2021</w:t>
+        <w:rPr>
+          <w:b/>
+        </w:rPr>
+        <w:t>2026 - Present</w:t>
       </w:r>
     </w:p>
     <w:p>
@@ -1736,65 +1641,11 @@
         <w:rPr>
           <w:b/>
         </w:rPr>
-        <w:t xml:space="preserve">Academic Standing: </w:t>
-      </w:r>
-      <w:r>
-        <w:rPr>
-          <w:bCs/>
-        </w:rPr>
-        <w:t>Upper Credit</w:t>
-      </w:r>
-    </w:p>
-    <w:p>
-      <w:pPr>
-        <w:widowControl/>
-        <w:numPr>
-          <w:ilvl w:val="0"/>
-          <w:numId w:val="7"/>
-        </w:numPr>
-        <w:autoSpaceDE/>
-        <w:autoSpaceDN/>
-        <w:spacing w:after="4" w:line="249" w:lineRule="auto"/>
-        <w:rPr>
-          <w:sz w:val="20"/>
-          <w:szCs w:val="20"/>
-        </w:rPr>
-      </w:pPr>
-      <w:r>
-        <w:rPr>
-          <w:b/>
-          <w:sz w:val="20"/>
-          <w:szCs w:val="20"/>
-        </w:rPr>
-        <w:t xml:space="preserve">Key Areas of Study: </w:t>
-      </w:r>
-      <w:r>
-        <w:rPr>
-          <w:sz w:val="20"/>
-          <w:szCs w:val="20"/>
-        </w:rPr>
-        <w:t>Structural analysis, construction materials, surveying, geotechnics, construction technology, quantity estimation, project planning, and site management.</w:t>
-      </w:r>
-      <w:r>
-        <w:rPr>
-          <w:b/>
-          <w:sz w:val="20"/>
-          <w:szCs w:val="20"/>
-        </w:rPr>
-        <w:t xml:space="preserve"> </w:t>
-      </w:r>
-    </w:p>
-    <w:p>
-      <w:pPr>
-        <w:pStyle w:val="BodyText"/>
-        <w:tabs>
-          <w:tab w:val="left" w:pos="9824"/>
-        </w:tabs>
-        <w:spacing w:line="222" w:lineRule="exact"/>
-        <w:rPr>
-          <w:b/>
-        </w:rPr>
-      </w:pPr>
+        <w:t xml:space="preserve">Status: </w:t>
+      </w:r>
+      <w:r>
+        <w:t>In progress</w:t>
+      </w:r>
     </w:p>
     <w:p>
       <w:pPr>
@@ -1811,7 +1662,7 @@
         <w:ind w:hanging="361"/>
       </w:pPr>
       <w:r>
-        <w:t xml:space="preserve">National Diploma (HND) – </w:t>
+        <w:t xml:space="preserve">Higher National Diploma (HND) – </w:t>
       </w:r>
       <w:r>
         <w:rPr>
@@ -1829,24 +1680,143 @@
         </w:tabs>
         <w:spacing w:line="222" w:lineRule="exact"/>
         <w:ind w:left="491"/>
+      </w:pPr>
+      <w:r>
+        <w:t xml:space="preserve">Delta State Polytechnic, Ozoro, Nigeria. </w:t>
+        <w:tab/>
+      </w:r>
+      <w:r>
+        <w:rPr>
+          <w:b/>
+        </w:rPr>
+        <w:t>2018 - 2021</w:t>
+      </w:r>
+    </w:p>
+    <w:p>
+      <w:pPr>
+        <w:pStyle w:val="BodyText"/>
+        <w:numPr>
+          <w:ilvl w:val="0"/>
+          <w:numId w:val="7"/>
+        </w:numPr>
+        <w:tabs>
+          <w:tab w:val="left" w:pos="9824"/>
+        </w:tabs>
+        <w:spacing w:line="222" w:lineRule="exact"/>
+        <w:rPr>
+          <w:b/>
+        </w:rPr>
+      </w:pPr>
+      <w:r>
+        <w:rPr>
+          <w:b/>
+        </w:rPr>
+        <w:t xml:space="preserve">Academic Standing: </w:t>
+      </w:r>
+      <w:r>
+        <w:rPr>
+          <w:bCs/>
+        </w:rPr>
+        <w:t>Upper Credit</w:t>
+      </w:r>
+    </w:p>
+    <w:p>
+      <w:pPr>
+        <w:widowControl/>
+        <w:numPr>
+          <w:ilvl w:val="0"/>
+          <w:numId w:val="7"/>
+        </w:numPr>
+        <w:autoSpaceDE/>
+        <w:autoSpaceDN/>
+        <w:spacing w:after="4" w:line="249" w:lineRule="auto"/>
+        <w:rPr>
+          <w:sz w:val="20"/>
+          <w:szCs w:val="20"/>
+        </w:rPr>
+      </w:pPr>
+      <w:r>
+        <w:rPr>
+          <w:b/>
+          <w:sz w:val="20"/>
+          <w:szCs w:val="20"/>
+        </w:rPr>
+        <w:t xml:space="preserve">Key Areas of Study: </w:t>
+      </w:r>
+      <w:r>
+        <w:rPr>
+          <w:sz w:val="20"/>
+          <w:szCs w:val="20"/>
+        </w:rPr>
+        <w:t>Structural analysis, construction materials, surveying, geotechnics, construction technology, quantity estimation, project planning, and site management.</w:t>
+      </w:r>
+      <w:r>
+        <w:rPr>
+          <w:b/>
+          <w:sz w:val="20"/>
+          <w:szCs w:val="20"/>
+        </w:rPr>
+        <w:t xml:space="preserve"> </w:t>
+      </w:r>
+    </w:p>
+    <w:p>
+      <w:pPr>
+        <w:pStyle w:val="BodyText"/>
+        <w:tabs>
+          <w:tab w:val="left" w:pos="9824"/>
+        </w:tabs>
+        <w:spacing w:line="222" w:lineRule="exact"/>
+        <w:rPr>
+          <w:b/>
+        </w:rPr>
+      </w:pPr>
+    </w:p>
+    <w:p>
+      <w:pPr>
+        <w:pStyle w:val="Heading2"/>
+        <w:numPr>
+          <w:ilvl w:val="0"/>
+          <w:numId w:val="1"/>
+        </w:numPr>
+        <w:tabs>
+          <w:tab w:val="left" w:pos="491"/>
+          <w:tab w:val="left" w:pos="492"/>
+        </w:tabs>
+        <w:spacing w:line="232" w:lineRule="exact"/>
+        <w:ind w:hanging="361"/>
+      </w:pPr>
+      <w:r>
+        <w:t xml:space="preserve">National Diploma (HND) – </w:t>
+      </w:r>
+      <w:r>
+        <w:rPr>
+          <w:b w:val="0"/>
+          <w:bCs w:val="0"/>
+        </w:rPr>
+        <w:t xml:space="preserve">Civil Engineering </w:t>
+      </w:r>
+    </w:p>
+    <w:p>
+      <w:pPr>
+        <w:pStyle w:val="BodyText"/>
+        <w:tabs>
+          <w:tab w:val="left" w:pos="9824"/>
+        </w:tabs>
+        <w:spacing w:line="222" w:lineRule="exact"/>
+        <w:ind w:left="491"/>
         <w:rPr>
           <w:b/>
         </w:rPr>
       </w:pPr>
       <w:r>
         <w:t>Delta State Polytechnic, Ozoro, Nigeria.</w:t>
-      </w:r>
-      <w:r>
         <w:tab/>
       </w:r>
       <w:r>
-        <w:tab/>
-      </w:r>
-      <w:r>
-        <w:rPr>
-          <w:b/>
-        </w:rPr>
-        <w:t>2013-2015</w:t>
+        <w:rPr>
+          <w:b/>
+        </w:rPr>
+        <w:t>2013 - 2015</w:t>
       </w:r>
     </w:p>
     <w:p>
@@ -1873,19 +1843,7 @@
         <w:rPr>
           <w:color w:val="539E39"/>
         </w:rPr>
-        <w:t>CERTIFICAT</w:t>
-      </w:r>
-      <w:r>
-        <w:rPr>
-          <w:color w:val="539E39"/>
-        </w:rPr>
-        <w:t>IONS/TRAININGS</w:t>
-      </w:r>
-      <w:r>
-        <w:rPr>
-          <w:color w:val="539E39"/>
-        </w:rPr>
-        <w:t xml:space="preserve"> </w:t>
+        <w:t xml:space="preserve">CERTIFICATIONS/TRAININGS </w:t>
       </w:r>
     </w:p>
     <w:p>
@@ -1970,8 +1928,8 @@
           </mc:Choice>
           <mc:Fallback>
             <w:pict>
-              <v:group w14:anchorId="008BB321" id="Group 10" o:spid="_x0000_s1026" style="width:541.95pt;height:.75pt;mso-position-horizontal-relative:char;mso-position-vertical-relative:line" coordsize="10839,15" o:gfxdata="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">
-                <v:rect id="Rectangle 11" o:spid="_x0000_s1027" style="position:absolute;width:10839;height:15;visibility:visible;mso-wrap-style:square;v-text-anchor:top" o:gfxdata="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" fillcolor="black" stroked="f"/>
+              <v:group w14:anchorId="008BB321" id="Group 10" o:spid="_x0000_s1026" style="width:541.95pt;height:.75pt;mso-position-horizontal-relative:char;mso-position-vertical-relative:line" coordsize="10839,15" o:gfxdata="UEsDBBQABgAIAAAAIQC2gziS/gAAAOEBAAATAAAAW0NvbnRlbnRfVHlwZXNdLnhtbJSRQU7DMBBF 90jcwfIWJU67QAgl6YK0S0CoHGBkTxKLZGx5TGhvj5O2G0SRWNoz/78nu9wcxkFMGNg6quQqL6RA 0s5Y6ir5vt9lD1JwBDIwOMJKHpHlpr69KfdHjyxSmriSfYz+USnWPY7AufNIadK6MEJMx9ApD/oD OlTrorhX2lFEilmcO2RdNtjC5xDF9pCuTyYBB5bi6bQ4syoJ3g9WQ0ymaiLzg5KdCXlKLjvcW893 SUOqXwnz5DrgnHtJTxOsQfEKIT7DmDSUCaxw7Rqn8787ZsmRM9e2VmPeBN4uqYvTtW7jvijg9N/y JsXecLq0q+WD6m8AAAD//wMAUEsDBBQABgAIAAAAIQA4/SH/1gAAAJQBAAALAAAAX3JlbHMvLnJl bHOkkMFqwzAMhu+DvYPRfXGawxijTi+j0GvpHsDYimMaW0Yy2fr2M4PBMnrbUb/Q94l/f/hMi1qR JVI2sOt6UJgd+ZiDgffL8ekFlFSbvV0oo4EbChzGx4f9GRdb25HMsYhqlCwG5lrLq9biZkxWOiqY 22YiTra2kYMu1l1tQD30/bPm3wwYN0x18gb45AdQl1tp5j/sFB2T0FQ7R0nTNEV3j6o9feQzro1i OWA14Fm+Q8a1a8+Bvu/d/dMb2JY5uiPbhG/ktn4cqGU/er3pcvwCAAD//wMAUEsDBBQABgAIAAAA IQCjlmmPRwIAAAcFAAAOAAAAZHJzL2Uyb0RvYy54bWykVNuO2jAQfa/Uf7D8XkIosBARViu2iypt 21W3/QDjOBc18bhjQ6Bf37FNge6qLzQPkcdz8TlnPF7c7ruW7RTaBnTO08GQM6UlFI2ucv7928O7 GWfWCV2IFrTK+UFZfrt8+2bRm0yNoIa2UMioiLZZb3JeO2eyJLGyVp2wAzBKk7ME7IQjE6ukQNFT 9a5NRsPhNOkBC4MglbW0ex+dfBnql6WS7ktZWuVYm3PC5sIfw3/j/8lyIbIKhakbeYQhrkDRiUbT oadS98IJtsXmVamukQgWSjeQ0CVQlo1UgQOxSYcv2KwRtiZwqbK+MieZSNoXOl1dVn7erdE8myeM 6Gn5CPKHJV2S3lTZpd/bVQxmm/4TFNRPsXUQiO9L7HwJosT2Qd/DSV+1d0zS5nQ2G91MJ5xJ8s0n o0mUX9bUo1dJsv5wTEuHs/fzmJSGlERk8bgA8QjJt5zukD3LZP9PpudaGBXUt16GJ2RNkfMxZ1p0 xPwr3S2hq1axNPU8/OkU9kdKG3VkGlY1hak7ROhrJQpCFeIJ+0WCNyx14Tph/62QyAxat1bQMb/I ORLs0DCxe7TOt/kc4vtnoW2Kh6Ztg4HVZtUi2wk/PuHzVCnlr7BW+2ANPi26/U4g6DlFbTZQHIgf QpxBejNoUQP+4qyn+cu5/bkVqDhrP2rSaJ6Ox35ggzGe3IzIwEvP5tIjtKRSOXecxeXKxSHfGmyq mk5KA2kNd3RhyyYQ95pHVEewdHnCKkxboHl8Gfw4X9oh6vx+LX8DAAD//wMAUEsDBBQABgAIAAAA IQCf2dFV2wAAAAQBAAAPAAAAZHJzL2Rvd25yZXYueG1sTI9Ba8JAEIXvhf6HZQre6iYVxcZsRKT2 JAW1ULyN2TEJZmdDdk3iv+/ai70Mb3jDe9+ky8HUoqPWVZYVxOMIBHFudcWFgu/D5nUOwnlkjbVl UnAjB8vs+SnFRNued9TtfSFCCLsEFZTeN4mULi/JoBvbhjh4Z9sa9GFtC6lb7EO4qeVbFM2kwYpD Q4kNrUvKL/urUfDZY7+axB/d9nJe346H6dfPNialRi/DagHC0+Afx3DHD+iQBaaTvbJ2olYQHvF/ 8+5F88k7iFNQU5BZKv/DZ78AAAD//wMAUEsBAi0AFAAGAAgAAAAhALaDOJL+AAAA4QEAABMAAAAA AAAAAAAAAAAAAAAAAFtDb250ZW50X1R5cGVzXS54bWxQSwECLQAUAAYACAAAACEAOP0h/9YAAACU AQAACwAAAAAAAAAAAAAAAAAvAQAAX3JlbHMvLnJlbHNQSwECLQAUAAYACAAAACEAo5Zpj0cCAAAH BQAADgAAAAAAAAAAAAAAAAAuAgAAZHJzL2Uyb0RvYy54bWxQSwECLQAUAAYACAAAACEAn9nRVdsA AAAEAQAADwAAAAAAAAAAAAAAAAChBAAAZHJzL2Rvd25yZXYueG1sUEsFBgAAAAAEAAQA8wAAAKkF AAAAAA== ">
+                <v:rect id="Rectangle 11" o:spid="_x0000_s1027" style="position:absolute;width:10839;height:15;visibility:visible;mso-wrap-style:square;v-text-anchor:top" o:gfxdata="UEsDBBQABgAIAAAAIQDb4fbL7gAAAIUBAAATAAAAW0NvbnRlbnRfVHlwZXNdLnhtbHyQz07DMAyH 70i8Q+QralM4IITa7kDhCAiNB7ASt43WOlEcyvb2pNu4IODoPz9/n1xv9vOkForiPDdwXVagiI23 jocG3rdPxR0oScgWJ8/UwIEENu3lRb09BBKV0ywNjCmFe63FjDSjlD4Q50nv44wpl3HQAc0OB9I3 VXWrjedEnIq03oC27qjHjympx31un0wiTQLq4bS4shrAECZnMGVTvbD9QSnOhDInjzsyuiBXWQP0 r4R18jfgnHvJr4nOknrFmJ5xzhraRtHWf3Kkpfz/yGo5S+H73hkquyhdjr3R8m2lj09svwAAAP// AwBQSwMEFAAGAAgAAAAhAFr0LFu/AAAAFQEAAAsAAABfcmVscy8ucmVsc2zPwWrDMAwG4Ptg72B0 X5TuUMaI01uh19I+gLGVxCy2jGSy9e1nemrHjpL4P0nD4SetZiPRyNnCruvBUPYcYp4tXC/Htw8w Wl0ObuVMFm6kcBhfX4Yzra62kC6xqGlKVgtLreUTUf1CyWnHhXKbTCzJ1VbKjMX5LzcTvvf9HuXR gPHJNKdgQU5hB+ZyK23zHztFL6w81c5zQp6m6P9TMfB3PtPWFCczVQtB9N4U2rp2HOA44NMz4y8A AAD//wMAUEsDBBQABgAIAAAAIQAac31YxAAAANoAAAAPAAAAZHJzL2Rvd25yZXYueG1sRI9BawIx FITvQv9DeEJvblbRoqtRaqHgRVDbg96em+fu4uZlm0Td9tc3guBxmJlvmNmiNbW4kvOVZQX9JAVB nFtdcaHg++uzNwbhA7LG2jIp+CUPi/lLZ4aZtjfe0nUXChEh7DNUUIbQZFL6vCSDPrENcfRO1hkM UbpCaoe3CDe1HKTpmzRYcVwosaGPkvLz7mIULCfj5c9myOu/7fFAh/3xPBq4VKnXbvs+BRGoDc/w o73SCoZwvxJvgJz/AwAA//8DAFBLAQItABQABgAIAAAAIQDb4fbL7gAAAIUBAAATAAAAAAAAAAAA AAAAAAAAAABbQ29udGVudF9UeXBlc10ueG1sUEsBAi0AFAAGAAgAAAAhAFr0LFu/AAAAFQEAAAsA AAAAAAAAAAAAAAAAHwEAAF9yZWxzLy5yZWxzUEsBAi0AFAAGAAgAAAAhABpzfVjEAAAA2gAAAA8A AAAAAAAAAAAAAAAABwIAAGRycy9kb3ducmV2LnhtbFBLBQYAAAAAAwADALcAAAD4AgAAAAA= " fillcolor="black" stroked="f"/>
                 <w10:anchorlock/>
               </v:group>
             </w:pict>
@@ -2001,63 +1959,13 @@
           <w:bCs/>
           <w:sz w:val="19"/>
         </w:rPr>
-        <w:t>Competence HSE</w:t>
-      </w:r>
-      <w:r>
-        <w:rPr>
-          <w:b/>
-          <w:bCs/>
+        <w:t xml:space="preserve">Competence HSE (Health, Safety, and Environment) Course - Level 1,2, and 3: </w:t>
+      </w:r>
+      <w:r>
+        <w:rPr>
           <w:sz w:val="19"/>
         </w:rPr>
-        <w:t xml:space="preserve"> (Health, Safety, and Environment)</w:t>
-      </w:r>
-      <w:r>
-        <w:rPr>
-          <w:b/>
-          <w:bCs/>
-          <w:sz w:val="19"/>
-        </w:rPr>
-        <w:t xml:space="preserve"> Course</w:t>
-      </w:r>
-      <w:r>
-        <w:rPr>
-          <w:b/>
-          <w:bCs/>
-          <w:sz w:val="19"/>
-        </w:rPr>
-        <w:t xml:space="preserve"> -</w:t>
-      </w:r>
-      <w:r>
-        <w:rPr>
-          <w:b/>
-          <w:bCs/>
-          <w:sz w:val="19"/>
-        </w:rPr>
-        <w:t xml:space="preserve"> Level 1,2, and 3: </w:t>
-      </w:r>
-      <w:r>
-        <w:rPr>
-          <w:sz w:val="19"/>
-        </w:rPr>
-        <w:t xml:space="preserve"> Benchmark Professionals</w:t>
-      </w:r>
-      <w:r>
-        <w:rPr>
-          <w:sz w:val="19"/>
-        </w:rPr>
-        <w:t>/NIPEX</w:t>
-      </w:r>
-      <w:r>
-        <w:rPr>
-          <w:sz w:val="19"/>
-        </w:rPr>
-        <w:t xml:space="preserve"> </w:t>
-      </w:r>
-      <w:r>
-        <w:rPr>
-          <w:sz w:val="19"/>
-        </w:rPr>
-        <w:t xml:space="preserve">     </w:t>
+        <w:t xml:space="preserve"> Benchmark Professionals/NIPEX      </w:t>
       </w:r>
       <w:r>
         <w:rPr>
@@ -2099,14 +2007,7 @@
           <w:sz w:val="20"/>
           <w:szCs w:val="20"/>
         </w:rPr>
-        <w:t xml:space="preserve"> Top Notch Interior Design School                                                                                       </w:t>
-      </w:r>
-      <w:r>
-        <w:rPr>
-          <w:sz w:val="20"/>
-          <w:szCs w:val="20"/>
-        </w:rPr>
-        <w:t xml:space="preserve"> </w:t>
+        <w:t xml:space="preserve"> Top Notch Interior Design School                                                                                        </w:t>
       </w:r>
       <w:r>
         <w:rPr>
@@ -2152,64 +2053,29 @@
           <w:bCs/>
           <w:sz w:val="19"/>
         </w:rPr>
-        <w:t>Certification of Participation</w:t>
+        <w:t>Certification of Participation:</w:t>
+      </w:r>
+      <w:r>
+        <w:rPr>
+          <w:sz w:val="19"/>
+        </w:rPr>
+        <w:t xml:space="preserve"> SOJ Automobile                                                                                                                                          </w:t>
+      </w:r>
+      <w:r>
+        <w:rPr>
+          <w:sz w:val="20"/>
+          <w:szCs w:val="20"/>
+        </w:rPr>
+        <w:t xml:space="preserve"> </w:t>
       </w:r>
       <w:r>
         <w:rPr>
           <w:b/>
           <w:bCs/>
-          <w:sz w:val="19"/>
-        </w:rPr>
-        <w:t>:</w:t>
-      </w:r>
-      <w:r>
-        <w:rPr>
-          <w:sz w:val="19"/>
-        </w:rPr>
-        <w:t xml:space="preserve"> SOJ Automobile</w:t>
-      </w:r>
-      <w:r>
-        <w:rPr>
-          <w:sz w:val="19"/>
-        </w:rPr>
-        <w:t xml:space="preserve">                                    </w:t>
-      </w:r>
-      <w:r>
-        <w:rPr>
-          <w:sz w:val="19"/>
-        </w:rPr>
-        <w:t xml:space="preserve"> </w:t>
-      </w:r>
-      <w:r>
-        <w:rPr>
-          <w:sz w:val="19"/>
-        </w:rPr>
-        <w:t xml:space="preserve">                                                                                                     </w:t>
-      </w:r>
-      <w:r>
-        <w:rPr>
-          <w:sz w:val="20"/>
-          <w:szCs w:val="20"/>
-        </w:rPr>
-        <w:t xml:space="preserve"> </w:t>
-      </w:r>
-      <w:r>
-        <w:rPr>
-          <w:b/>
-          <w:bCs/>
-          <w:sz w:val="20"/>
-          <w:szCs w:val="20"/>
-        </w:rPr>
-        <w:t>202</w:t>
-      </w:r>
-      <w:r>
-        <w:rPr>
-          <w:b/>
-          <w:bCs/>
-          <w:sz w:val="20"/>
-          <w:szCs w:val="20"/>
-        </w:rPr>
-        <w:t>1</w:t>
+          <w:sz w:val="20"/>
+          <w:szCs w:val="20"/>
+        </w:rPr>
+        <w:t>2021</w:t>
       </w:r>
       <w:r>
         <w:rPr>
@@ -2242,45 +2108,22 @@
           <w:bCs/>
           <w:sz w:val="19"/>
         </w:rPr>
-        <w:t xml:space="preserve">Diploma in </w:t>
+        <w:t xml:space="preserve">Diploma in Front-End Web Development: </w:t>
+      </w:r>
+      <w:r>
+        <w:rPr>
+          <w:sz w:val="19"/>
+        </w:rPr>
+        <w:t xml:space="preserve">JAM-Forte Technologies Ltd                                                                                          </w:t>
       </w:r>
       <w:r>
         <w:rPr>
           <w:b/>
           <w:bCs/>
-          <w:sz w:val="19"/>
-        </w:rPr>
-        <w:t xml:space="preserve">Front-End Web Development: </w:t>
-      </w:r>
-      <w:r>
-        <w:rPr>
-          <w:sz w:val="19"/>
-        </w:rPr>
-        <w:t>JAM-</w:t>
-      </w:r>
-      <w:r>
-        <w:rPr>
-          <w:sz w:val="19"/>
-        </w:rPr>
-        <w:t xml:space="preserve">Forte Technologies Ltd                                                                                          </w:t>
-      </w:r>
-      <w:r>
-        <w:rPr>
-          <w:b/>
-          <w:bCs/>
-          <w:sz w:val="20"/>
-          <w:szCs w:val="20"/>
-        </w:rPr>
-        <w:t>2</w:t>
-      </w:r>
-      <w:r>
-        <w:rPr>
-          <w:b/>
-          <w:bCs/>
-          <w:sz w:val="20"/>
-          <w:szCs w:val="20"/>
-        </w:rPr>
-        <w:t>023</w:t>
+          <w:sz w:val="20"/>
+          <w:szCs w:val="20"/>
+        </w:rPr>
+        <w:t>2023</w:t>
       </w:r>
     </w:p>
     <w:p>
@@ -2306,43 +2149,14 @@
           <w:sz w:val="20"/>
           <w:szCs w:val="20"/>
         </w:rPr>
-        <w:t>TEF</w:t>
-      </w:r>
-      <w:r>
-        <w:rPr>
-          <w:b/>
-          <w:sz w:val="20"/>
-          <w:szCs w:val="20"/>
-        </w:rPr>
-        <w:t xml:space="preserve">L Certificate </w:t>
-      </w:r>
-      <w:r>
-        <w:rPr>
-          <w:sz w:val="20"/>
-          <w:szCs w:val="20"/>
-        </w:rPr>
-        <w:t xml:space="preserve">(Teaching English as a Foreign </w:t>
-      </w:r>
-      <w:r>
-        <w:rPr>
-          <w:sz w:val="20"/>
-          <w:szCs w:val="20"/>
-        </w:rPr>
-        <w:t>Language</w:t>
-      </w:r>
-      <w:r>
-        <w:rPr>
-          <w:sz w:val="20"/>
-          <w:szCs w:val="20"/>
-        </w:rPr>
-        <w:t xml:space="preserve">)           </w:t>
-      </w:r>
-      <w:r>
-        <w:rPr>
-          <w:sz w:val="20"/>
-          <w:szCs w:val="20"/>
-        </w:rPr>
-        <w:t xml:space="preserve">                                                                                              </w:t>
+        <w:t xml:space="preserve">TEFL Certificate </w:t>
+      </w:r>
+      <w:r>
+        <w:rPr>
+          <w:sz w:val="20"/>
+          <w:szCs w:val="20"/>
+        </w:rPr>
+        <w:t xml:space="preserve">(Teaching English as a Foreign Language)                                                                                                         </w:t>
       </w:r>
       <w:r>
         <w:rPr>
@@ -2392,7 +2206,7 @@
           <w:sz w:val="20"/>
           <w:szCs w:val="20"/>
         </w:rPr>
-        <w:t xml:space="preserve">                                                                                                     </w:t>
+        <w:t xml:space="preserve">                                                                                                    </w:t>
       </w:r>
     </w:p>
     <w:sectPr>

</xml_diff>